<commit_message>
Added Assignment 2 files, Week 12 files, Week 9 files
</commit_message>
<xml_diff>
--- a/Assignment 2/Heart Risk Report.docx
+++ b/Assignment 2/Heart Risk Report.docx
@@ -25,10 +25,30 @@
         <w:t xml:space="preserve"> </w:t>
       </w:r>
       <w:r>
-        <w:t>Using our Heart Risk dataset, we will be determining key factors in what causes heart risks. We will thoroughly analyze the dataset using a process called exploratory data analysis to determine key characteristics or features and will be using the decided features to create and evaluate a model that can best predict heart risk.</w:t>
-      </w:r>
-    </w:p>
-    <w:p/>
+        <w:t xml:space="preserve">Based on our </w:t>
+      </w:r>
+      <w:r>
+        <w:t>Heart Risk dataset, we will be determining</w:t>
+      </w:r>
+      <w:r>
+        <w:t xml:space="preserve"> what is the potential cause of a person’s </w:t>
+      </w:r>
+      <w:proofErr w:type="spellStart"/>
+      <w:r>
+        <w:rPr>
+          <w:b/>
+          <w:bCs/>
+        </w:rPr>
+        <w:t>HighRisk</w:t>
+      </w:r>
+      <w:proofErr w:type="spellEnd"/>
+      <w:r>
+        <w:t xml:space="preserve"> status</w:t>
+      </w:r>
+      <w:r>
+        <w:t>. We will thoroughly analyze the dataset using a process called exploratory data analysis to determine key characteristics or features and will be using the decided features to create and evaluate a model that can best predict heart risk.</w:t>
+      </w:r>
+    </w:p>
     <w:p>
       <w:pPr>
         <w:pStyle w:val="Heading2"/>
@@ -37,8 +57,40 @@
         <w:t>Exploratory Data Analysis</w:t>
       </w:r>
     </w:p>
-    <w:p/>
-    <w:p/>
+    <w:p>
+      <w:pPr>
+        <w:ind w:firstLine="720"/>
+      </w:pPr>
+      <w:r>
+        <w:t>This section explores the dataset to identify key data fields for model creation. It includes initial, univariate, and multivariate analyses</w:t>
+      </w:r>
+      <w:r>
+        <w:t xml:space="preserve"> which we will discuss more in depth in </w:t>
+      </w:r>
+      <w:proofErr w:type="gramStart"/>
+      <w:r>
+        <w:t>there</w:t>
+      </w:r>
+      <w:proofErr w:type="gramEnd"/>
+      <w:r>
+        <w:t xml:space="preserve"> sections</w:t>
+      </w:r>
+      <w:r>
+        <w:t xml:space="preserve">. For efficient exploration and testing post-Figure 2, a 10% sample will be used. </w:t>
+      </w:r>
+      <w:r>
+        <w:t xml:space="preserve">Although, for training the </w:t>
+      </w:r>
+      <w:r>
+        <w:t xml:space="preserve">final model will </w:t>
+      </w:r>
+      <w:r>
+        <w:t xml:space="preserve">be using the full </w:t>
+      </w:r>
+      <w:r>
+        <w:t>300,000 data points.</w:t>
+      </w:r>
+    </w:p>
     <w:p>
       <w:pPr>
         <w:pStyle w:val="Heading3"/>
@@ -48,20 +100,72 @@
       </w:r>
     </w:p>
     <w:p>
+      <w:r>
+        <w:tab/>
+        <w:t xml:space="preserve">This segment investigates the whole dataset, exploring areas such as data field types, numerical statistics, and the best possible candidates that can help predict whether an individual is </w:t>
+      </w:r>
+      <w:proofErr w:type="spellStart"/>
+      <w:r>
+        <w:rPr>
+          <w:b/>
+          <w:bCs/>
+        </w:rPr>
+        <w:t>HighRisk</w:t>
+      </w:r>
+      <w:proofErr w:type="spellEnd"/>
+      <w:r>
+        <w:t>.</w:t>
+      </w:r>
+    </w:p>
+    <w:p>
       <w:pPr>
-        <w:pStyle w:val="Heading3"/>
+        <w:rPr>
+          <w:b/>
+          <w:bCs/>
+        </w:rPr>
       </w:pPr>
       <w:r>
-        <w:t>Univariate Analysis</w:t>
+        <w:tab/>
+        <w:t xml:space="preserve">Figure 1 </w:t>
+      </w:r>
+      <w:proofErr w:type="gramStart"/>
+      <w:r>
+        <w:t>showcases</w:t>
+      </w:r>
+      <w:proofErr w:type="gramEnd"/>
+      <w:r>
+        <w:t xml:space="preserve"> the inconsistency of data which will be preprocessed.</w:t>
+      </w:r>
+      <w:r>
+        <w:rPr>
+          <w:b/>
+          <w:bCs/>
+        </w:rPr>
+        <w:t xml:space="preserve"> </w:t>
+      </w:r>
+    </w:p>
+    <w:p>
+      <w:pPr>
+        <w:rPr>
+          <w:i/>
+          <w:iCs/>
+        </w:rPr>
+      </w:pPr>
+      <w:r>
+        <w:rPr>
+          <w:i/>
+          <w:iCs/>
+        </w:rPr>
+        <w:t>Figure 1 Inconsistent field values</w:t>
       </w:r>
     </w:p>
     <w:p>
       <w:r>
         <w:drawing>
-          <wp:inline distT="0" distB="0" distL="0" distR="0" wp14:anchorId="3B400873" wp14:editId="382E204A">
-            <wp:extent cx="5943600" cy="3962400"/>
+          <wp:inline distT="0" distB="0" distL="0" distR="0" wp14:anchorId="0557B1D1" wp14:editId="22C2F955">
+            <wp:extent cx="2520922" cy="2958919"/>
             <wp:effectExtent l="0" t="0" r="0" b="0"/>
-            <wp:docPr id="1998554616" name="Picture 1" descr="A group of blue and white bars&#10;&#10;AI-generated content may be incorrect."/>
+            <wp:docPr id="512800649" name="Picture 1" descr="A screenshot of a computer&#10;&#10;AI-generated content may be incorrect."/>
             <wp:cNvGraphicFramePr>
               <a:graphicFrameLocks xmlns:a="http://schemas.openxmlformats.org/drawingml/2006/main" noChangeAspect="1"/>
             </wp:cNvGraphicFramePr>
@@ -69,11 +173,396 @@
               <a:graphicData uri="http://schemas.openxmlformats.org/drawingml/2006/picture">
                 <pic:pic xmlns:pic="http://schemas.openxmlformats.org/drawingml/2006/picture">
                   <pic:nvPicPr>
-                    <pic:cNvPr id="1998554616" name="Picture 1" descr="A group of blue and white bars&#10;&#10;AI-generated content may be incorrect."/>
+                    <pic:cNvPr id="512800649" name="Picture 1" descr="A screenshot of a computer&#10;&#10;AI-generated content may be incorrect."/>
                     <pic:cNvPicPr/>
                   </pic:nvPicPr>
                   <pic:blipFill>
                     <a:blip r:embed="rId4"/>
+                    <a:stretch>
+                      <a:fillRect/>
+                    </a:stretch>
+                  </pic:blipFill>
+                  <pic:spPr>
+                    <a:xfrm>
+                      <a:off x="0" y="0"/>
+                      <a:ext cx="2534552" cy="2974917"/>
+                    </a:xfrm>
+                    <a:prstGeom prst="rect">
+                      <a:avLst/>
+                    </a:prstGeom>
+                  </pic:spPr>
+                </pic:pic>
+              </a:graphicData>
+            </a:graphic>
+          </wp:inline>
+        </w:drawing>
+      </w:r>
+      <w:r>
+        <w:drawing>
+          <wp:inline distT="0" distB="0" distL="0" distR="0" wp14:anchorId="2CAADEE3" wp14:editId="2A8A801D">
+            <wp:extent cx="2953657" cy="2947831"/>
+            <wp:effectExtent l="0" t="0" r="0" b="5080"/>
+            <wp:docPr id="1908216422" name="Picture 1" descr="A screenshot of a computer program&#10;&#10;AI-generated content may be incorrect."/>
+            <wp:cNvGraphicFramePr>
+              <a:graphicFrameLocks xmlns:a="http://schemas.openxmlformats.org/drawingml/2006/main" noChangeAspect="1"/>
+            </wp:cNvGraphicFramePr>
+            <a:graphic xmlns:a="http://schemas.openxmlformats.org/drawingml/2006/main">
+              <a:graphicData uri="http://schemas.openxmlformats.org/drawingml/2006/picture">
+                <pic:pic xmlns:pic="http://schemas.openxmlformats.org/drawingml/2006/picture">
+                  <pic:nvPicPr>
+                    <pic:cNvPr id="1908216422" name="Picture 1" descr="A screenshot of a computer program&#10;&#10;AI-generated content may be incorrect."/>
+                    <pic:cNvPicPr/>
+                  </pic:nvPicPr>
+                  <pic:blipFill>
+                    <a:blip r:embed="rId5"/>
+                    <a:stretch>
+                      <a:fillRect/>
+                    </a:stretch>
+                  </pic:blipFill>
+                  <pic:spPr>
+                    <a:xfrm>
+                      <a:off x="0" y="0"/>
+                      <a:ext cx="2972620" cy="2966756"/>
+                    </a:xfrm>
+                    <a:prstGeom prst="rect">
+                      <a:avLst/>
+                    </a:prstGeom>
+                  </pic:spPr>
+                </pic:pic>
+              </a:graphicData>
+            </a:graphic>
+          </wp:inline>
+        </w:drawing>
+      </w:r>
+    </w:p>
+    <w:p>
+      <w:pPr>
+        <w:ind w:firstLine="720"/>
+      </w:pPr>
+      <w:r>
+        <w:lastRenderedPageBreak/>
+        <w:t>Figure 2 show cases us the two types of fields which are numerical with a count of 6 fields and categorical which has a count of 33 fields. This will also be considered during preprocessing for model creation.</w:t>
+      </w:r>
+    </w:p>
+    <w:p>
+      <w:pPr>
+        <w:rPr>
+          <w:i/>
+          <w:iCs/>
+        </w:rPr>
+      </w:pPr>
+      <w:r>
+        <w:rPr>
+          <w:i/>
+          <w:iCs/>
+        </w:rPr>
+        <w:t>Figure 2 Data Field Types and Counts</w:t>
+      </w:r>
+    </w:p>
+    <w:p>
+      <w:r>
+        <w:drawing>
+          <wp:inline distT="0" distB="0" distL="0" distR="0" wp14:anchorId="7161CE5E" wp14:editId="6612FC3A">
+            <wp:extent cx="2732888" cy="587829"/>
+            <wp:effectExtent l="0" t="0" r="0" b="3175"/>
+            <wp:docPr id="1485728332" name="Picture 1"/>
+            <wp:cNvGraphicFramePr>
+              <a:graphicFrameLocks xmlns:a="http://schemas.openxmlformats.org/drawingml/2006/main" noChangeAspect="1"/>
+            </wp:cNvGraphicFramePr>
+            <a:graphic xmlns:a="http://schemas.openxmlformats.org/drawingml/2006/main">
+              <a:graphicData uri="http://schemas.openxmlformats.org/drawingml/2006/picture">
+                <pic:pic xmlns:pic="http://schemas.openxmlformats.org/drawingml/2006/picture">
+                  <pic:nvPicPr>
+                    <pic:cNvPr id="1485728332" name=""/>
+                    <pic:cNvPicPr/>
+                  </pic:nvPicPr>
+                  <pic:blipFill>
+                    <a:blip r:embed="rId6"/>
+                    <a:stretch>
+                      <a:fillRect/>
+                    </a:stretch>
+                  </pic:blipFill>
+                  <pic:spPr>
+                    <a:xfrm>
+                      <a:off x="0" y="0"/>
+                      <a:ext cx="2762721" cy="594246"/>
+                    </a:xfrm>
+                    <a:prstGeom prst="rect">
+                      <a:avLst/>
+                    </a:prstGeom>
+                  </pic:spPr>
+                </pic:pic>
+              </a:graphicData>
+            </a:graphic>
+          </wp:inline>
+        </w:drawing>
+      </w:r>
+    </w:p>
+    <w:p>
+      <w:r>
+        <w:tab/>
+        <w:t xml:space="preserve">Figure 3 shows us the best potential candidates for numerical values in a </w:t>
+      </w:r>
+      <w:r>
+        <w:t xml:space="preserve">correlation </w:t>
+      </w:r>
+      <w:r>
+        <w:t xml:space="preserve">heatmap. </w:t>
+      </w:r>
+      <w:r>
+        <w:t>Values</w:t>
+      </w:r>
+      <w:r>
+        <w:t xml:space="preserve"> </w:t>
+      </w:r>
+      <w:r>
+        <w:t xml:space="preserve">closer to the beige </w:t>
+      </w:r>
+      <w:proofErr w:type="spellStart"/>
+      <w:r>
+        <w:t>colour</w:t>
+      </w:r>
+      <w:proofErr w:type="spellEnd"/>
+      <w:r>
+        <w:t xml:space="preserve"> mean they are positively correlated with the data field </w:t>
+      </w:r>
+      <w:proofErr w:type="spellStart"/>
+      <w:r>
+        <w:rPr>
+          <w:b/>
+          <w:bCs/>
+        </w:rPr>
+        <w:t>HighRisk</w:t>
+      </w:r>
+      <w:proofErr w:type="spellEnd"/>
+      <w:r>
+        <w:t xml:space="preserve"> otherwise those closer to dark purple are negatively correlated. In our case it seems all numerical values are negatively correlated with </w:t>
+      </w:r>
+      <w:proofErr w:type="spellStart"/>
+      <w:r>
+        <w:rPr>
+          <w:b/>
+          <w:bCs/>
+        </w:rPr>
+        <w:t>HighRisk</w:t>
+      </w:r>
+      <w:proofErr w:type="spellEnd"/>
+      <w:r>
+        <w:rPr>
+          <w:b/>
+          <w:bCs/>
+        </w:rPr>
+        <w:t xml:space="preserve"> </w:t>
+      </w:r>
+      <w:r>
+        <w:t>data field.</w:t>
+      </w:r>
+    </w:p>
+    <w:p>
+      <w:pPr>
+        <w:rPr>
+          <w:i/>
+          <w:iCs/>
+        </w:rPr>
+      </w:pPr>
+      <w:r>
+        <w:rPr>
+          <w:i/>
+          <w:iCs/>
+        </w:rPr>
+        <w:t>Figure 3 Correlation Heatmap of numerical values</w:t>
+      </w:r>
+    </w:p>
+    <w:p>
+      <w:pPr>
+        <w:jc w:val="center"/>
+      </w:pPr>
+      <w:r>
+        <w:drawing>
+          <wp:inline distT="0" distB="0" distL="0" distR="0" wp14:anchorId="3642CAA2" wp14:editId="3BA362AB">
+            <wp:extent cx="5221959" cy="5152572"/>
+            <wp:effectExtent l="0" t="0" r="0" b="0"/>
+            <wp:docPr id="1576155899" name="Picture 1" descr="A screenshot of a graph&#10;&#10;AI-generated content may be incorrect."/>
+            <wp:cNvGraphicFramePr>
+              <a:graphicFrameLocks xmlns:a="http://schemas.openxmlformats.org/drawingml/2006/main" noChangeAspect="1"/>
+            </wp:cNvGraphicFramePr>
+            <a:graphic xmlns:a="http://schemas.openxmlformats.org/drawingml/2006/main">
+              <a:graphicData uri="http://schemas.openxmlformats.org/drawingml/2006/picture">
+                <pic:pic xmlns:pic="http://schemas.openxmlformats.org/drawingml/2006/picture">
+                  <pic:nvPicPr>
+                    <pic:cNvPr id="1576155899" name="Picture 1" descr="A screenshot of a graph&#10;&#10;AI-generated content may be incorrect."/>
+                    <pic:cNvPicPr/>
+                  </pic:nvPicPr>
+                  <pic:blipFill rotWithShape="1">
+                    <a:blip r:embed="rId7"/>
+                    <a:srcRect t="10018" r="12345" b="3492"/>
+                    <a:stretch/>
+                  </pic:blipFill>
+                  <pic:spPr bwMode="auto">
+                    <a:xfrm>
+                      <a:off x="0" y="0"/>
+                      <a:ext cx="5236470" cy="5166890"/>
+                    </a:xfrm>
+                    <a:prstGeom prst="rect">
+                      <a:avLst/>
+                    </a:prstGeom>
+                    <a:ln>
+                      <a:noFill/>
+                    </a:ln>
+                    <a:extLst>
+                      <a:ext uri="{53640926-AAD7-44D8-BBD7-CCE9431645EC}">
+                        <a14:shadowObscured xmlns:a14="http://schemas.microsoft.com/office/drawing/2010/main"/>
+                      </a:ext>
+                    </a:extLst>
+                  </pic:spPr>
+                </pic:pic>
+              </a:graphicData>
+            </a:graphic>
+          </wp:inline>
+        </w:drawing>
+      </w:r>
+    </w:p>
+    <w:p/>
+    <w:p>
+      <w:pPr>
+        <w:pStyle w:val="Heading3"/>
+      </w:pPr>
+      <w:r>
+        <w:t>Univariate Analysis</w:t>
+      </w:r>
+    </w:p>
+    <w:p>
+      <w:r>
+        <w:tab/>
+        <w:t xml:space="preserve">In this section we </w:t>
+      </w:r>
+      <w:r>
+        <w:t>look</w:t>
+      </w:r>
+      <w:r>
+        <w:t xml:space="preserve"> at individual data fields to discover any issues they may contain</w:t>
+      </w:r>
+      <w:r>
+        <w:t xml:space="preserve"> as well as trends. This will help us further decide which data fields will be useful. </w:t>
+      </w:r>
+    </w:p>
+    <w:p>
+      <w:r>
+        <w:tab/>
+        <w:t xml:space="preserve">Figure 4 showcases us the numerical fields as a histogram. We can clearly see that </w:t>
+      </w:r>
+      <w:proofErr w:type="gramStart"/>
+      <w:r>
+        <w:t>that</w:t>
+      </w:r>
+      <w:proofErr w:type="gramEnd"/>
+      <w:r>
+        <w:t xml:space="preserve"> distribution of all the fields </w:t>
+      </w:r>
+      <w:proofErr w:type="gramStart"/>
+      <w:r>
+        <w:t>are</w:t>
+      </w:r>
+      <w:proofErr w:type="gramEnd"/>
+      <w:r>
+        <w:t xml:space="preserve"> abnormal. We can also see that </w:t>
+      </w:r>
+      <w:proofErr w:type="spellStart"/>
+      <w:r>
+        <w:rPr>
+          <w:b/>
+          <w:bCs/>
+        </w:rPr>
+        <w:t>SleepHours</w:t>
+      </w:r>
+      <w:proofErr w:type="spellEnd"/>
+      <w:r>
+        <w:rPr>
+          <w:b/>
+          <w:bCs/>
+        </w:rPr>
+        <w:t xml:space="preserve">, </w:t>
+      </w:r>
+      <w:proofErr w:type="spellStart"/>
+      <w:r>
+        <w:rPr>
+          <w:b/>
+          <w:bCs/>
+        </w:rPr>
+        <w:t>HeightInMeters</w:t>
+      </w:r>
+      <w:proofErr w:type="spellEnd"/>
+      <w:r>
+        <w:rPr>
+          <w:b/>
+          <w:bCs/>
+        </w:rPr>
+        <w:t xml:space="preserve">, </w:t>
+      </w:r>
+      <w:proofErr w:type="spellStart"/>
+      <w:r>
+        <w:rPr>
+          <w:b/>
+          <w:bCs/>
+        </w:rPr>
+        <w:t>WeightInKilograms</w:t>
+      </w:r>
+      <w:proofErr w:type="spellEnd"/>
+      <w:r>
+        <w:rPr>
+          <w:b/>
+          <w:bCs/>
+        </w:rPr>
+        <w:t xml:space="preserve"> </w:t>
+      </w:r>
+      <w:r>
+        <w:t xml:space="preserve">and </w:t>
+      </w:r>
+      <w:r>
+        <w:rPr>
+          <w:b/>
+          <w:bCs/>
+        </w:rPr>
+        <w:t>BMI</w:t>
+      </w:r>
+      <w:r>
+        <w:t xml:space="preserve"> have outliers based on the empty spaces on the edges. Outliers can indicate very abnormal values either too large or too small.</w:t>
+      </w:r>
+    </w:p>
+    <w:p>
+      <w:pPr>
+        <w:rPr>
+          <w:i/>
+          <w:iCs/>
+        </w:rPr>
+      </w:pPr>
+      <w:r>
+        <w:rPr>
+          <w:i/>
+          <w:iCs/>
+        </w:rPr>
+        <w:t>Figure 4 Numeric Data Fields Histogram</w:t>
+      </w:r>
+    </w:p>
+    <w:p>
+      <w:r>
+        <w:drawing>
+          <wp:inline distT="0" distB="0" distL="0" distR="0" wp14:anchorId="54DAE0EF" wp14:editId="50E1C475">
+            <wp:extent cx="5943600" cy="3962400"/>
+            <wp:effectExtent l="0" t="0" r="0" b="0"/>
+            <wp:docPr id="1265238071" name="Picture 1" descr="A group of blue and white bars&#10;&#10;AI-generated content may be incorrect."/>
+            <wp:cNvGraphicFramePr>
+              <a:graphicFrameLocks xmlns:a="http://schemas.openxmlformats.org/drawingml/2006/main" noChangeAspect="1"/>
+            </wp:cNvGraphicFramePr>
+            <a:graphic xmlns:a="http://schemas.openxmlformats.org/drawingml/2006/main">
+              <a:graphicData uri="http://schemas.openxmlformats.org/drawingml/2006/picture">
+                <pic:pic xmlns:pic="http://schemas.openxmlformats.org/drawingml/2006/picture">
+                  <pic:nvPicPr>
+                    <pic:cNvPr id="1265238071" name="Picture 1" descr="A group of blue and white bars&#10;&#10;AI-generated content may be incorrect."/>
+                    <pic:cNvPicPr/>
+                  </pic:nvPicPr>
+                  <pic:blipFill>
+                    <a:blip r:embed="rId8"/>
                     <a:stretch>
                       <a:fillRect/>
                     </a:stretch>
@@ -94,14 +583,34 @@
         </w:drawing>
       </w:r>
     </w:p>
-    <w:p>
-      <w:r>
+    <w:p/>
+    <w:p/>
+    <w:p/>
+    <w:p/>
+    <w:p/>
+    <w:p>
+      <w:pPr>
+        <w:rPr>
+          <w:i/>
+          <w:iCs/>
+        </w:rPr>
+      </w:pPr>
+      <w:r>
+        <w:rPr>
+          <w:i/>
+          <w:iCs/>
+        </w:rPr>
         <w:lastRenderedPageBreak/>
+        <w:t>Figure 5 Binary Categorical Columns</w:t>
+      </w:r>
+    </w:p>
+    <w:p>
+      <w:r>
         <w:drawing>
-          <wp:inline distT="0" distB="0" distL="0" distR="0" wp14:anchorId="130B2CAA" wp14:editId="29F7D391">
-            <wp:extent cx="5878195" cy="8229600"/>
-            <wp:effectExtent l="0" t="0" r="8255" b="0"/>
-            <wp:docPr id="104428778" name="Picture 1" descr="A screenshot of a graph&#10;&#10;AI-generated content may be incorrect."/>
+          <wp:inline distT="0" distB="0" distL="0" distR="0" wp14:anchorId="2A013612" wp14:editId="46C68CB6">
+            <wp:extent cx="5943600" cy="5943600"/>
+            <wp:effectExtent l="0" t="0" r="0" b="0"/>
+            <wp:docPr id="918132420" name="Picture 1" descr="A group of blue rectangular bars&#10;&#10;AI-generated content may be incorrect."/>
             <wp:cNvGraphicFramePr>
               <a:graphicFrameLocks xmlns:a="http://schemas.openxmlformats.org/drawingml/2006/main" noChangeAspect="1"/>
             </wp:cNvGraphicFramePr>
@@ -109,11 +618,11 @@
               <a:graphicData uri="http://schemas.openxmlformats.org/drawingml/2006/picture">
                 <pic:pic xmlns:pic="http://schemas.openxmlformats.org/drawingml/2006/picture">
                   <pic:nvPicPr>
-                    <pic:cNvPr id="104428778" name="Picture 1" descr="A screenshot of a graph&#10;&#10;AI-generated content may be incorrect."/>
+                    <pic:cNvPr id="918132420" name="Picture 1" descr="A group of blue rectangular bars&#10;&#10;AI-generated content may be incorrect."/>
                     <pic:cNvPicPr/>
                   </pic:nvPicPr>
                   <pic:blipFill>
-                    <a:blip r:embed="rId5"/>
+                    <a:blip r:embed="rId9"/>
                     <a:stretch>
                       <a:fillRect/>
                     </a:stretch>
@@ -121,7 +630,7 @@
                   <pic:spPr>
                     <a:xfrm>
                       <a:off x="0" y="0"/>
-                      <a:ext cx="5878195" cy="8229600"/>
+                      <a:ext cx="5943600" cy="5943600"/>
                     </a:xfrm>
                     <a:prstGeom prst="rect">
                       <a:avLst/>
@@ -134,12 +643,52 @@
         </w:drawing>
       </w:r>
     </w:p>
+    <w:p/>
+    <w:p>
+      <w:r>
+        <w:lastRenderedPageBreak/>
+        <w:drawing>
+          <wp:inline distT="0" distB="0" distL="0" distR="0" wp14:anchorId="43300CB3" wp14:editId="08E7BCCC">
+            <wp:extent cx="5943600" cy="4457700"/>
+            <wp:effectExtent l="0" t="0" r="0" b="0"/>
+            <wp:docPr id="1120930193" name="Picture 1"/>
+            <wp:cNvGraphicFramePr>
+              <a:graphicFrameLocks xmlns:a="http://schemas.openxmlformats.org/drawingml/2006/main" noChangeAspect="1"/>
+            </wp:cNvGraphicFramePr>
+            <a:graphic xmlns:a="http://schemas.openxmlformats.org/drawingml/2006/main">
+              <a:graphicData uri="http://schemas.openxmlformats.org/drawingml/2006/picture">
+                <pic:pic xmlns:pic="http://schemas.openxmlformats.org/drawingml/2006/picture">
+                  <pic:nvPicPr>
+                    <pic:cNvPr id="1120930193" name=""/>
+                    <pic:cNvPicPr/>
+                  </pic:nvPicPr>
+                  <pic:blipFill>
+                    <a:blip r:embed="rId10"/>
+                    <a:stretch>
+                      <a:fillRect/>
+                    </a:stretch>
+                  </pic:blipFill>
+                  <pic:spPr>
+                    <a:xfrm>
+                      <a:off x="0" y="0"/>
+                      <a:ext cx="5943600" cy="4457700"/>
+                    </a:xfrm>
+                    <a:prstGeom prst="rect">
+                      <a:avLst/>
+                    </a:prstGeom>
+                  </pic:spPr>
+                </pic:pic>
+              </a:graphicData>
+            </a:graphic>
+          </wp:inline>
+        </w:drawing>
+      </w:r>
+    </w:p>
     <w:p>
       <w:pPr>
         <w:pStyle w:val="Heading3"/>
       </w:pPr>
       <w:r>
-        <w:lastRenderedPageBreak/>
         <w:t>Multivariate Analysis</w:t>
       </w:r>
     </w:p>
@@ -779,7 +1328,6 @@
   <w:style w:type="character" w:default="1" w:styleId="DefaultParagraphFont">
     <w:name w:val="Default Paragraph Font"/>
     <w:uiPriority w:val="1"/>
-    <w:semiHidden/>
     <w:unhideWhenUsed/>
   </w:style>
   <w:style w:type="table" w:default="1" w:styleId="TableNormal">

</xml_diff>